<commit_message>
Spaltennamen aus MATOOLs Kopfzeile statt Durchnummerierung
- Der generische Extraktor leitet die Feldnamen jetzt aus der Kopfzeile
  ab. Aus c00..c04 werden nr, datum, vorname, name, status.
- MATOOL kennzeichnet Kopfzeilen ueber die Klasse master_tab_tr_head mit
  gewoehnlichen td-Zellen, nicht ueber th. Beide Formen werden erkannt.
- Kopfzeilen werden nicht mehr als Datensaetze gespeichert.
- Widersprechen sich zwei Kopfzeilen gleicher Breite, bleibt die
  Nummerierung erhalten, statt einen falschen Namen zu waehlen.
- Die Feld-Allowlist beim Speichern akzeptiert die abgeleiteten Namen,
  begrenzt auf 200 Felder je Lauf.

Co-Authored-By: Claude Opus 5 <noreply@anthropic.com>
</commit_message>
<xml_diff>
--- a/docs/MATOOL-Middleware-Hub_Status-und-Freigabe.docx
+++ b/docs/MATOOL-Middleware-Hub_Status-und-Freigabe.docx
@@ -1817,7 +1817,10 @@
     </w:p>
     <w:p>
       <w:pPr>
-        <w:spacing w:after="0" w:line="252" w:lineRule="auto"/>
+        <w:spacing w:line="252" w:lineRule="auto"/>
+        <w:rPr>
+          <w:lang w:val="de-DE"/>
+        </w:rPr>
       </w:pPr>
       <w:r>
         <w:rPr>
@@ -1825,7 +1828,25 @@
           <w:color w:val="5B6573"/>
           <w:sz w:val="19"/>
         </w:rPr>
-        <w:t xml:space="preserve">Cloudflare-Preise: </w:t>
+        <w:t>Cloudflare-</w:t>
+      </w:r>
+      <w:proofErr w:type="spellStart"/>
+      <w:r>
+        <w:rPr>
+          <w:b/>
+          <w:color w:val="5B6573"/>
+          <w:sz w:val="19"/>
+        </w:rPr>
+        <w:t>Preise</w:t>
+      </w:r>
+      <w:proofErr w:type="spellEnd"/>
+      <w:r>
+        <w:rPr>
+          <w:b/>
+          <w:color w:val="5B6573"/>
+          <w:sz w:val="19"/>
+        </w:rPr>
+        <w:t xml:space="preserve">: </w:t>
       </w:r>
       <w:hyperlink r:id="rId10">
         <w:r>
@@ -1837,6 +1858,597 @@
           <w:t>developers.cloudflare.com/workers/platform/pricing/</w:t>
         </w:r>
       </w:hyperlink>
+      <w:r>
+        <w:br/>
+      </w:r>
+      <w:r>
+        <w:rPr>
+          <w:b/>
+          <w:bCs/>
+          <w:lang w:val="de-DE"/>
+        </w:rPr>
+        <w:br/>
+      </w:r>
+      <w:r>
+        <w:rPr>
+          <w:b/>
+          <w:bCs/>
+          <w:lang w:val="de-DE"/>
+        </w:rPr>
+        <w:br/>
+      </w:r>
+      <w:r>
+        <w:rPr>
+          <w:b/>
+          <w:bCs/>
+          <w:lang w:val="de-DE"/>
+        </w:rPr>
+        <w:br/>
+      </w:r>
+      <w:r>
+        <w:rPr>
+          <w:b/>
+          <w:bCs/>
+          <w:lang w:val="de-DE"/>
+        </w:rPr>
+        <w:br/>
+      </w:r>
+      <w:r>
+        <w:rPr>
+          <w:b/>
+          <w:bCs/>
+          <w:lang w:val="de-DE"/>
+        </w:rPr>
+        <w:br/>
+      </w:r>
+      <w:r>
+        <w:rPr>
+          <w:b/>
+          <w:bCs/>
+          <w:lang w:val="de-DE"/>
+        </w:rPr>
+        <w:br/>
+      </w:r>
+      <w:r>
+        <w:rPr>
+          <w:b/>
+          <w:bCs/>
+          <w:lang w:val="de-DE"/>
+        </w:rPr>
+        <w:br/>
+      </w:r>
+      <w:r>
+        <w:rPr>
+          <w:b/>
+          <w:bCs/>
+          <w:lang w:val="de-DE"/>
+        </w:rPr>
+        <w:br/>
+      </w:r>
+      <w:r>
+        <w:rPr>
+          <w:b/>
+          <w:bCs/>
+          <w:lang w:val="de-DE"/>
+        </w:rPr>
+        <w:br/>
+      </w:r>
+      <w:r>
+        <w:rPr>
+          <w:b/>
+          <w:bCs/>
+          <w:lang w:val="de-DE"/>
+        </w:rPr>
+        <w:br/>
+      </w:r>
+      <w:r>
+        <w:rPr>
+          <w:b/>
+          <w:bCs/>
+          <w:lang w:val="de-DE"/>
+        </w:rPr>
+        <w:br/>
+      </w:r>
+      <w:r>
+        <w:rPr>
+          <w:b/>
+          <w:bCs/>
+          <w:lang w:val="de-DE"/>
+        </w:rPr>
+        <w:br/>
+      </w:r>
+      <w:r>
+        <w:rPr>
+          <w:b/>
+          <w:bCs/>
+          <w:lang w:val="de-DE"/>
+        </w:rPr>
+        <w:br/>
+      </w:r>
+      <w:r>
+        <w:rPr>
+          <w:b/>
+          <w:bCs/>
+          <w:lang w:val="de-DE"/>
+        </w:rPr>
+        <w:br/>
+      </w:r>
+      <w:r>
+        <w:rPr>
+          <w:b/>
+          <w:bCs/>
+          <w:lang w:val="de-DE"/>
+        </w:rPr>
+        <w:br/>
+      </w:r>
+      <w:r>
+        <w:rPr>
+          <w:b/>
+          <w:bCs/>
+          <w:lang w:val="de-DE"/>
+        </w:rPr>
+        <w:br/>
+      </w:r>
+      <w:r>
+        <w:rPr>
+          <w:b/>
+          <w:bCs/>
+          <w:lang w:val="de-DE"/>
+        </w:rPr>
+        <w:br/>
+      </w:r>
+      <w:r>
+        <w:rPr>
+          <w:b/>
+          <w:bCs/>
+          <w:lang w:val="de-DE"/>
+        </w:rPr>
+        <w:br/>
+      </w:r>
+      <w:r>
+        <w:rPr>
+          <w:b/>
+          <w:bCs/>
+          <w:lang w:val="de-DE"/>
+        </w:rPr>
+        <w:br/>
+      </w:r>
+      <w:r>
+        <w:rPr>
+          <w:b/>
+          <w:bCs/>
+          <w:lang w:val="de-DE"/>
+        </w:rPr>
+        <w:br/>
+      </w:r>
+      <w:r>
+        <w:rPr>
+          <w:b/>
+          <w:bCs/>
+          <w:lang w:val="de-DE"/>
+        </w:rPr>
+        <w:br/>
+      </w:r>
+      <w:r>
+        <w:rPr>
+          <w:b/>
+          <w:bCs/>
+          <w:lang w:val="de-DE"/>
+        </w:rPr>
+        <w:lastRenderedPageBreak/>
+        <w:t>1</w:t>
+      </w:r>
+      <w:r>
+        <w:rPr>
+          <w:lang w:val="de-DE"/>
+        </w:rPr>
+        <w:t>. Cloudflare Workers Paid buchen (~5 $/Monat). Das ist der größte Hebel und blockiert gleich drei Dinge:</w:t>
+      </w:r>
+    </w:p>
+    <w:p>
+      <w:pPr>
+        <w:numPr>
+          <w:ilvl w:val="0"/>
+          <w:numId w:val="2"/>
+        </w:numPr>
+        <w:spacing w:after="0" w:line="252" w:lineRule="auto"/>
+        <w:rPr>
+          <w:lang w:val="de-DE"/>
+        </w:rPr>
+      </w:pPr>
+      <w:r>
+        <w:rPr>
+          <w:lang w:val="de-DE"/>
+        </w:rPr>
+        <w:t>Läufe brechen mit </w:t>
+      </w:r>
+      <w:proofErr w:type="spellStart"/>
+      <w:r>
+        <w:rPr>
+          <w:lang w:val="de-DE"/>
+        </w:rPr>
+        <w:t>exceededCpu</w:t>
+      </w:r>
+      <w:proofErr w:type="spellEnd"/>
+      <w:r>
+        <w:rPr>
+          <w:lang w:val="de-DE"/>
+        </w:rPr>
+        <w:t> ab, bevor alle Bereiche durch sind</w:t>
+      </w:r>
+    </w:p>
+    <w:p>
+      <w:pPr>
+        <w:numPr>
+          <w:ilvl w:val="0"/>
+          <w:numId w:val="2"/>
+        </w:numPr>
+        <w:spacing w:after="0" w:line="252" w:lineRule="auto"/>
+        <w:rPr>
+          <w:lang w:val="de-DE"/>
+        </w:rPr>
+      </w:pPr>
+      <w:r>
+        <w:rPr>
+          <w:lang w:val="de-DE"/>
+        </w:rPr>
+        <w:t xml:space="preserve">Ohne Paid keine </w:t>
+      </w:r>
+      <w:proofErr w:type="spellStart"/>
+      <w:r>
+        <w:rPr>
+          <w:lang w:val="de-DE"/>
+        </w:rPr>
+        <w:t>Pagination</w:t>
+      </w:r>
+      <w:proofErr w:type="spellEnd"/>
+      <w:r>
+        <w:rPr>
+          <w:lang w:val="de-DE"/>
+        </w:rPr>
+        <w:t xml:space="preserve"> (50 statt 1.000 </w:t>
+      </w:r>
+      <w:proofErr w:type="spellStart"/>
+      <w:r>
+        <w:rPr>
+          <w:lang w:val="de-DE"/>
+        </w:rPr>
+        <w:t>Subrequests</w:t>
+      </w:r>
+      <w:proofErr w:type="spellEnd"/>
+      <w:r>
+        <w:rPr>
+          <w:lang w:val="de-DE"/>
+        </w:rPr>
+        <w:t>) → wir sehen nur die erste Seite je Bereich</w:t>
+      </w:r>
+    </w:p>
+    <w:p>
+      <w:pPr>
+        <w:numPr>
+          <w:ilvl w:val="0"/>
+          <w:numId w:val="2"/>
+        </w:numPr>
+        <w:spacing w:after="0" w:line="252" w:lineRule="auto"/>
+        <w:rPr>
+          <w:lang w:val="de-DE"/>
+        </w:rPr>
+      </w:pPr>
+      <w:r>
+        <w:rPr>
+          <w:lang w:val="de-DE"/>
+        </w:rPr>
+        <w:t>Erst danach lässt sich das CPU-Limit setzen; die Zeile liegt vorbereitet als Kommentar in </w:t>
+      </w:r>
+      <w:proofErr w:type="spellStart"/>
+      <w:proofErr w:type="gramStart"/>
+      <w:r>
+        <w:rPr>
+          <w:lang w:val="de-DE"/>
+        </w:rPr>
+        <w:t>wrangler.jsonc</w:t>
+      </w:r>
+      <w:proofErr w:type="spellEnd"/>
+      <w:proofErr w:type="gramEnd"/>
+    </w:p>
+    <w:p>
+      <w:pPr>
+        <w:spacing w:after="0" w:line="252" w:lineRule="auto"/>
+        <w:rPr>
+          <w:b/>
+          <w:bCs/>
+          <w:lang w:val="de-DE"/>
+        </w:rPr>
+      </w:pPr>
+      <w:r>
+        <w:rPr>
+          <w:b/>
+          <w:bCs/>
+          <w:lang w:val="de-DE"/>
+        </w:rPr>
+        <w:t>Datenqualität — die eigentliche Lücke</w:t>
+      </w:r>
+    </w:p>
+    <w:p>
+      <w:pPr>
+        <w:spacing w:after="0" w:line="252" w:lineRule="auto"/>
+        <w:rPr>
+          <w:lang w:val="de-DE"/>
+        </w:rPr>
+      </w:pPr>
+      <w:r>
+        <w:rPr>
+          <w:lang w:val="de-DE"/>
+        </w:rPr>
+        <w:t xml:space="preserve">3. </w:t>
+      </w:r>
+      <w:proofErr w:type="spellStart"/>
+      <w:r>
+        <w:rPr>
+          <w:lang w:val="de-DE"/>
+        </w:rPr>
+        <w:t>Pagination</w:t>
+      </w:r>
+      <w:proofErr w:type="spellEnd"/>
+      <w:r>
+        <w:rPr>
+          <w:lang w:val="de-DE"/>
+        </w:rPr>
+        <w:t xml:space="preserve"> fehlt. MATOOL zeigt 30 Zeilen je Seite, geblättert wird über &amp;</w:t>
+      </w:r>
+      <w:proofErr w:type="spellStart"/>
+      <w:r>
+        <w:rPr>
+          <w:lang w:val="de-DE"/>
+        </w:rPr>
+        <w:t>offset</w:t>
+      </w:r>
+      <w:proofErr w:type="spellEnd"/>
+      <w:r>
+        <w:rPr>
+          <w:lang w:val="de-DE"/>
+        </w:rPr>
+        <w:t>=30/60/…. Was ihr gerade seht, ist unvollständig.</w:t>
+      </w:r>
+    </w:p>
+    <w:p>
+      <w:pPr>
+        <w:spacing w:after="0" w:line="252" w:lineRule="auto"/>
+        <w:rPr>
+          <w:lang w:val="de-DE"/>
+        </w:rPr>
+      </w:pPr>
+      <w:r>
+        <w:rPr>
+          <w:lang w:val="de-DE"/>
+        </w:rPr>
+        <w:t>4. Spaltennamen bei den meisten Bereichen. </w:t>
+      </w:r>
+      <w:proofErr w:type="spellStart"/>
+      <w:r>
+        <w:rPr>
+          <w:lang w:val="de-DE"/>
+        </w:rPr>
+        <w:t>klassen</w:t>
+      </w:r>
+      <w:proofErr w:type="spellEnd"/>
+      <w:r>
+        <w:rPr>
+          <w:lang w:val="de-DE"/>
+        </w:rPr>
+        <w:t xml:space="preserve"> ist sauber benannt (weil über die JSON-Schnittstelle gelesen), alle anderen liefern c00–c04. </w:t>
+      </w:r>
+      <w:proofErr w:type="gramStart"/>
+      <w:r>
+        <w:rPr>
+          <w:lang w:val="de-DE"/>
+        </w:rPr>
+        <w:t>Inhaltlich</w:t>
+      </w:r>
+      <w:proofErr w:type="gramEnd"/>
+      <w:r>
+        <w:rPr>
+          <w:lang w:val="de-DE"/>
+        </w:rPr>
+        <w:t xml:space="preserve"> korrekt, aber in </w:t>
+      </w:r>
+      <w:proofErr w:type="spellStart"/>
+      <w:r>
+        <w:rPr>
+          <w:lang w:val="de-DE"/>
+        </w:rPr>
+        <w:t>Zapier</w:t>
+      </w:r>
+      <w:proofErr w:type="spellEnd"/>
+      <w:r>
+        <w:rPr>
+          <w:lang w:val="de-DE"/>
+        </w:rPr>
+        <w:t xml:space="preserve"> schlecht benutzbar.</w:t>
+      </w:r>
+    </w:p>
+    <w:p>
+      <w:pPr>
+        <w:spacing w:after="0" w:line="252" w:lineRule="auto"/>
+        <w:rPr>
+          <w:lang w:val="de-DE"/>
+        </w:rPr>
+      </w:pPr>
+      <w:r>
+        <w:rPr>
+          <w:lang w:val="de-DE"/>
+        </w:rPr>
+        <w:t>5. Standortfilter fehlt. Raubling (1734), Rosenheim (273), Stephanskirchen (1474) — ohne den Filter liefert MATOOL „alle Schulen" und die Zahlen sind nicht pro Standort trennbar.</w:t>
+      </w:r>
+    </w:p>
+    <w:p>
+      <w:pPr>
+        <w:spacing w:after="0" w:line="252" w:lineRule="auto"/>
+        <w:rPr>
+          <w:lang w:val="de-DE"/>
+        </w:rPr>
+      </w:pPr>
+      <w:r>
+        <w:rPr>
+          <w:lang w:val="de-DE"/>
+        </w:rPr>
+        <w:t>6. Zwei Bereiche noch nicht angeschlossen: berichte und </w:t>
+      </w:r>
+      <w:proofErr w:type="spellStart"/>
+      <w:r>
+        <w:rPr>
+          <w:lang w:val="de-DE"/>
+        </w:rPr>
+        <w:t>telemetrie</w:t>
+      </w:r>
+      <w:proofErr w:type="spellEnd"/>
+      <w:r>
+        <w:rPr>
+          <w:lang w:val="de-DE"/>
+        </w:rPr>
+        <w:t>. Beide brauchen wie </w:t>
+      </w:r>
+      <w:proofErr w:type="spellStart"/>
+      <w:r>
+        <w:rPr>
+          <w:lang w:val="de-DE"/>
+        </w:rPr>
+        <w:t>klassen</w:t>
+      </w:r>
+      <w:proofErr w:type="spellEnd"/>
+      <w:r>
+        <w:rPr>
+          <w:lang w:val="de-DE"/>
+        </w:rPr>
+        <w:t> den JSON-Weg, nicht das HTML.</w:t>
+      </w:r>
+    </w:p>
+    <w:p>
+      <w:pPr>
+        <w:spacing w:after="0" w:line="252" w:lineRule="auto"/>
+        <w:rPr>
+          <w:b/>
+          <w:bCs/>
+          <w:lang w:val="de-DE"/>
+        </w:rPr>
+      </w:pPr>
+      <w:proofErr w:type="spellStart"/>
+      <w:r>
+        <w:rPr>
+          <w:b/>
+          <w:bCs/>
+          <w:lang w:val="de-DE"/>
+        </w:rPr>
+        <w:t>Zapier</w:t>
+      </w:r>
+      <w:proofErr w:type="spellEnd"/>
+    </w:p>
+    <w:p>
+      <w:pPr>
+        <w:spacing w:after="0" w:line="252" w:lineRule="auto"/>
+        <w:rPr>
+          <w:lang w:val="de-DE"/>
+        </w:rPr>
+      </w:pPr>
+      <w:r>
+        <w:rPr>
+          <w:lang w:val="de-DE"/>
+        </w:rPr>
+        <w:t>7. Verbindung real testen. Die Abholschnittstelle und der Polling-Trigger stehen, sind aber noch nie mit einem echten </w:t>
+      </w:r>
+      <w:proofErr w:type="spellStart"/>
+      <w:r>
+        <w:rPr>
+          <w:lang w:val="de-DE"/>
+        </w:rPr>
+        <w:t>Zap</w:t>
+      </w:r>
+      <w:proofErr w:type="spellEnd"/>
+      <w:r>
+        <w:rPr>
+          <w:lang w:val="de-DE"/>
+        </w:rPr>
+        <w:t> verbunden gewesen.</w:t>
+      </w:r>
+    </w:p>
+    <w:p>
+      <w:pPr>
+        <w:spacing w:after="0" w:line="252" w:lineRule="auto"/>
+        <w:rPr>
+          <w:b/>
+          <w:bCs/>
+          <w:lang w:val="de-DE"/>
+        </w:rPr>
+      </w:pPr>
+      <w:r>
+        <w:rPr>
+          <w:b/>
+          <w:bCs/>
+          <w:lang w:val="de-DE"/>
+        </w:rPr>
+        <w:t>Betrieb</w:t>
+      </w:r>
+    </w:p>
+    <w:p>
+      <w:pPr>
+        <w:spacing w:after="0" w:line="252" w:lineRule="auto"/>
+        <w:rPr>
+          <w:lang w:val="de-DE"/>
+        </w:rPr>
+      </w:pPr>
+      <w:r>
+        <w:rPr>
+          <w:lang w:val="de-DE"/>
+        </w:rPr>
+        <w:t>8. Einen ganzen Arbeitstag beobachten — laufen wirklich alle Stundenläufe zwischen 9 und 19 Uhr durch?</w:t>
+      </w:r>
+    </w:p>
+    <w:p>
+      <w:pPr>
+        <w:spacing w:after="0" w:line="252" w:lineRule="auto"/>
+        <w:rPr>
+          <w:lang w:val="de-DE"/>
+        </w:rPr>
+      </w:pPr>
+      <w:r>
+        <w:rPr>
+          <w:lang w:val="de-DE"/>
+        </w:rPr>
+        <w:t>9. Fehler sichtbar machen. Aktuell muss man in die Datenbank schauen, um zu sehen, dass ein Bereich gescheitert ist.</w:t>
+      </w:r>
+    </w:p>
+    <w:p>
+      <w:pPr>
+        <w:spacing w:after="0" w:line="252" w:lineRule="auto"/>
+        <w:rPr>
+          <w:lang w:val="de-DE"/>
+        </w:rPr>
+      </w:pPr>
+      <w:r>
+        <w:rPr>
+          <w:lang w:val="de-DE"/>
+        </w:rPr>
+        <w:t>10. Vor Echtdaten: PUBLIC_DASHBOARD_PLAINTEXT zurück auf </w:t>
+      </w:r>
+      <w:proofErr w:type="spellStart"/>
+      <w:r>
+        <w:rPr>
+          <w:lang w:val="de-DE"/>
+        </w:rPr>
+        <w:t>false</w:t>
+      </w:r>
+      <w:proofErr w:type="spellEnd"/>
+      <w:r>
+        <w:rPr>
+          <w:lang w:val="de-DE"/>
+        </w:rPr>
+        <w:t>, Cloudflare Access einrichten, getrennte Produktionsumgebung.</w:t>
+      </w:r>
+    </w:p>
+    <w:p>
+      <w:pPr>
+        <w:spacing w:after="0" w:line="252" w:lineRule="auto"/>
+      </w:pPr>
     </w:p>
     <w:sectPr>
       <w:headerReference w:type="default" r:id="rId11"/>
@@ -1881,12 +2493,21 @@
     <w:pPr>
       <w:pStyle w:val="Fuzeile"/>
     </w:pPr>
+    <w:proofErr w:type="gramStart"/>
     <w:r>
       <w:rPr>
         <w:color w:val="5B6573"/>
         <w:sz w:val="17"/>
       </w:rPr>
-      <w:t>Intern  |  Stand 10.08.2026</w:t>
+      <w:t>Intern  |</w:t>
+    </w:r>
+    <w:proofErr w:type="gramEnd"/>
+    <w:r>
+      <w:rPr>
+        <w:color w:val="5B6573"/>
+        <w:sz w:val="17"/>
+      </w:rPr>
+      <w:t xml:space="preserve">  Stand 10.08.2026</w:t>
     </w:r>
     <w:r>
       <w:rPr>
@@ -1894,7 +2515,22 @@
         <w:sz w:val="17"/>
       </w:rPr>
       <w:tab/>
-      <w:t xml:space="preserve">Seite </w:t>
+    </w:r>
+    <w:proofErr w:type="spellStart"/>
+    <w:r>
+      <w:rPr>
+        <w:color w:val="5B6573"/>
+        <w:sz w:val="17"/>
+      </w:rPr>
+      <w:t>Seite</w:t>
+    </w:r>
+    <w:proofErr w:type="spellEnd"/>
+    <w:r>
+      <w:rPr>
+        <w:color w:val="5B6573"/>
+        <w:sz w:val="17"/>
+      </w:rPr>
+      <w:t xml:space="preserve"> </w:t>
     </w:r>
     <w:r>
       <w:fldChar w:fldCharType="begin"/>
@@ -1952,13 +2588,51 @@
     <w:pPr>
       <w:pStyle w:val="Kopfzeile"/>
     </w:pPr>
+    <w:proofErr w:type="spellStart"/>
     <w:r>
       <w:rPr>
         <w:b/>
         <w:color w:val="5B6573"/>
         <w:sz w:val="17"/>
       </w:rPr>
-      <w:t>KwonRo Sportschule  |  MATOOL Middleware Hub</w:t>
+      <w:t>KwonRo</w:t>
+    </w:r>
+    <w:proofErr w:type="spellEnd"/>
+    <w:r>
+      <w:rPr>
+        <w:b/>
+        <w:color w:val="5B6573"/>
+        <w:sz w:val="17"/>
+      </w:rPr>
+      <w:t xml:space="preserve"> </w:t>
+    </w:r>
+    <w:proofErr w:type="spellStart"/>
+    <w:proofErr w:type="gramStart"/>
+    <w:r>
+      <w:rPr>
+        <w:b/>
+        <w:color w:val="5B6573"/>
+        <w:sz w:val="17"/>
+      </w:rPr>
+      <w:t>Sportschule</w:t>
+    </w:r>
+    <w:proofErr w:type="spellEnd"/>
+    <w:r>
+      <w:rPr>
+        <w:b/>
+        <w:color w:val="5B6573"/>
+        <w:sz w:val="17"/>
+      </w:rPr>
+      <w:t xml:space="preserve">  |</w:t>
+    </w:r>
+    <w:proofErr w:type="gramEnd"/>
+    <w:r>
+      <w:rPr>
+        <w:b/>
+        <w:color w:val="5B6573"/>
+        <w:sz w:val="17"/>
+      </w:rPr>
+      <w:t xml:space="preserve">  MATOOL Middleware Hub</w:t>
     </w:r>
   </w:p>
 </w:hdr>
@@ -2132,6 +2806,155 @@
     </w:lvl>
   </w:abstractNum>
   <w:abstractNum w:abstractNumId="9" w15:restartNumberingAfterBreak="0">
+    <w:nsid w:val="05472508"/>
+    <w:multiLevelType w:val="multilevel"/>
+    <w:tmpl w:val="9F1A56CE"/>
+    <w:lvl w:ilvl="0">
+      <w:start w:val="1"/>
+      <w:numFmt w:val="bullet"/>
+      <w:lvlText w:val=""/>
+      <w:lvlJc w:val="left"/>
+      <w:pPr>
+        <w:tabs>
+          <w:tab w:val="num" w:pos="720"/>
+        </w:tabs>
+        <w:ind w:left="720" w:hanging="360"/>
+      </w:pPr>
+      <w:rPr>
+        <w:rFonts w:ascii="Symbol" w:hAnsi="Symbol" w:hint="default"/>
+        <w:sz w:val="20"/>
+      </w:rPr>
+    </w:lvl>
+    <w:lvl w:ilvl="1" w:tentative="1">
+      <w:start w:val="1"/>
+      <w:numFmt w:val="bullet"/>
+      <w:lvlText w:val="o"/>
+      <w:lvlJc w:val="left"/>
+      <w:pPr>
+        <w:tabs>
+          <w:tab w:val="num" w:pos="1440"/>
+        </w:tabs>
+        <w:ind w:left="1440" w:hanging="360"/>
+      </w:pPr>
+      <w:rPr>
+        <w:rFonts w:ascii="Courier New" w:hAnsi="Courier New" w:hint="default"/>
+        <w:sz w:val="20"/>
+      </w:rPr>
+    </w:lvl>
+    <w:lvl w:ilvl="2" w:tentative="1">
+      <w:start w:val="1"/>
+      <w:numFmt w:val="bullet"/>
+      <w:lvlText w:val=""/>
+      <w:lvlJc w:val="left"/>
+      <w:pPr>
+        <w:tabs>
+          <w:tab w:val="num" w:pos="2160"/>
+        </w:tabs>
+        <w:ind w:left="2160" w:hanging="360"/>
+      </w:pPr>
+      <w:rPr>
+        <w:rFonts w:ascii="Wingdings" w:hAnsi="Wingdings" w:hint="default"/>
+        <w:sz w:val="20"/>
+      </w:rPr>
+    </w:lvl>
+    <w:lvl w:ilvl="3" w:tentative="1">
+      <w:start w:val="1"/>
+      <w:numFmt w:val="bullet"/>
+      <w:lvlText w:val=""/>
+      <w:lvlJc w:val="left"/>
+      <w:pPr>
+        <w:tabs>
+          <w:tab w:val="num" w:pos="2880"/>
+        </w:tabs>
+        <w:ind w:left="2880" w:hanging="360"/>
+      </w:pPr>
+      <w:rPr>
+        <w:rFonts w:ascii="Wingdings" w:hAnsi="Wingdings" w:hint="default"/>
+        <w:sz w:val="20"/>
+      </w:rPr>
+    </w:lvl>
+    <w:lvl w:ilvl="4" w:tentative="1">
+      <w:start w:val="1"/>
+      <w:numFmt w:val="bullet"/>
+      <w:lvlText w:val=""/>
+      <w:lvlJc w:val="left"/>
+      <w:pPr>
+        <w:tabs>
+          <w:tab w:val="num" w:pos="3600"/>
+        </w:tabs>
+        <w:ind w:left="3600" w:hanging="360"/>
+      </w:pPr>
+      <w:rPr>
+        <w:rFonts w:ascii="Wingdings" w:hAnsi="Wingdings" w:hint="default"/>
+        <w:sz w:val="20"/>
+      </w:rPr>
+    </w:lvl>
+    <w:lvl w:ilvl="5" w:tentative="1">
+      <w:start w:val="1"/>
+      <w:numFmt w:val="bullet"/>
+      <w:lvlText w:val=""/>
+      <w:lvlJc w:val="left"/>
+      <w:pPr>
+        <w:tabs>
+          <w:tab w:val="num" w:pos="4320"/>
+        </w:tabs>
+        <w:ind w:left="4320" w:hanging="360"/>
+      </w:pPr>
+      <w:rPr>
+        <w:rFonts w:ascii="Wingdings" w:hAnsi="Wingdings" w:hint="default"/>
+        <w:sz w:val="20"/>
+      </w:rPr>
+    </w:lvl>
+    <w:lvl w:ilvl="6" w:tentative="1">
+      <w:start w:val="1"/>
+      <w:numFmt w:val="bullet"/>
+      <w:lvlText w:val=""/>
+      <w:lvlJc w:val="left"/>
+      <w:pPr>
+        <w:tabs>
+          <w:tab w:val="num" w:pos="5040"/>
+        </w:tabs>
+        <w:ind w:left="5040" w:hanging="360"/>
+      </w:pPr>
+      <w:rPr>
+        <w:rFonts w:ascii="Wingdings" w:hAnsi="Wingdings" w:hint="default"/>
+        <w:sz w:val="20"/>
+      </w:rPr>
+    </w:lvl>
+    <w:lvl w:ilvl="7" w:tentative="1">
+      <w:start w:val="1"/>
+      <w:numFmt w:val="bullet"/>
+      <w:lvlText w:val=""/>
+      <w:lvlJc w:val="left"/>
+      <w:pPr>
+        <w:tabs>
+          <w:tab w:val="num" w:pos="5760"/>
+        </w:tabs>
+        <w:ind w:left="5760" w:hanging="360"/>
+      </w:pPr>
+      <w:rPr>
+        <w:rFonts w:ascii="Wingdings" w:hAnsi="Wingdings" w:hint="default"/>
+        <w:sz w:val="20"/>
+      </w:rPr>
+    </w:lvl>
+    <w:lvl w:ilvl="8" w:tentative="1">
+      <w:start w:val="1"/>
+      <w:numFmt w:val="bullet"/>
+      <w:lvlText w:val=""/>
+      <w:lvlJc w:val="left"/>
+      <w:pPr>
+        <w:tabs>
+          <w:tab w:val="num" w:pos="6480"/>
+        </w:tabs>
+        <w:ind w:left="6480" w:hanging="360"/>
+      </w:pPr>
+      <w:rPr>
+        <w:rFonts w:ascii="Wingdings" w:hAnsi="Wingdings" w:hint="default"/>
+        <w:sz w:val="20"/>
+      </w:rPr>
+    </w:lvl>
+  </w:abstractNum>
+  <w:abstractNum w:abstractNumId="10" w15:restartNumberingAfterBreak="0">
     <w:nsid w:val="0EE808DD"/>
     <w:multiLevelType w:val="singleLevel"/>
     <w:tmpl w:val="64C68BE2"/>
@@ -2149,7 +2972,7 @@
       </w:pPr>
     </w:lvl>
   </w:abstractNum>
-  <w:abstractNum w:abstractNumId="10" w15:restartNumberingAfterBreak="0">
+  <w:abstractNum w:abstractNumId="11" w15:restartNumberingAfterBreak="0">
     <w:nsid w:val="3FBC47D3"/>
     <w:multiLevelType w:val="singleLevel"/>
     <w:tmpl w:val="51BE68D4"/>
@@ -2169,7 +2992,10 @@
     </w:lvl>
   </w:abstractNum>
   <w:num w:numId="1" w16cid:durableId="40984386">
-    <w:abstractNumId w:val="10"/>
+    <w:abstractNumId w:val="11"/>
+  </w:num>
+  <w:num w:numId="2" w16cid:durableId="1342121620">
+    <w:abstractNumId w:val="9"/>
   </w:num>
 </w:numbering>
 </file>
@@ -2785,7 +3611,6 @@
   <w:style w:type="character" w:default="1" w:styleId="Absatz-Standardschriftart">
     <w:name w:val="Default Paragraph Font"/>
     <w:uiPriority w:val="1"/>
-    <w:semiHidden/>
     <w:unhideWhenUsed/>
   </w:style>
   <w:style w:type="table" w:default="1" w:styleId="NormaleTabelle">

</xml_diff>